<commit_message>
docs(submission): apply member profiles/roles to form answers (1-3, 1-8, 1-9) and regenerate html/docx/pdf/txt
Co-Authored-By: Claude Fable 5 <noreply@anthropic.com>
</commit_message>
<xml_diff>
--- a/docs/submission/2026-08-23-first-stage-submission.docx
+++ b/docs/submission/2026-08-23-first-stage-submission.docx
@@ -387,7 +387,7 @@
               <w:rPr>
                 <w:sz w:val="18"/>
               </w:rPr>
-              <w:t>にしておく（8/23は現地検証日）</w:t>
+              <w:t>にしておく（8/23当日は余裕がないため）</w:t>
             </w:r>
           </w:p>
         </w:tc>
@@ -414,7 +414,7 @@
         <w:pStyle w:val="ListBullet"/>
       </w:pPr>
       <w:r>
-        <w:t>人数：＿名　連絡担当者：＿＿（メール・電話）</w:t>
+        <w:t>人数：4名（清水・島田・志田・杉山）　連絡担当者：＿＿（メール・電話）</w:t>
       </w:r>
     </w:p>
     <w:p>
@@ -430,7 +430,7 @@
         <w:pStyle w:val="ListBullet"/>
       </w:pPr>
       <w:r>
-        <w:t>メンバー構成と役割：ドメイン設計・現地知見（清水）／PM・現地検証・提出物（島田）／データ（GTFS）・変換スクリプト／プロトタイプ・資料（＿＿）</w:t>
+        <w:t>メンバー構成と役割：清水道夫（ドメイン設計・GTFS）／島田光太郎（PM・提出物・開発）／志田健一（アドバイザー・地域連携・社会実装：SIDE BEACH CITY. 副理事長、Code for Hodogaya、NASA Space Apps Challenge Tokyo ローカルリード）／杉山由朗（オープンデータ・GTFS検証 ※本人確認後に確定）。詳細は docs/team/MEMBERS.md</w:t>
       </w:r>
     </w:p>
     <w:p>
@@ -438,7 +438,7 @@
         <w:pStyle w:val="ListBullet"/>
       </w:pPr>
       <w:r>
-        <w:t>運用体制：ハッカソン期間はチームで運用。以後はGitHubで公開・更新し、大島町・観光協会・宿泊事業者への提供を想定</w:t>
+        <w:t>運用体制：ハッカソン期間はチームで運用。以後はGitHubでOSS公開・GTFS改定ごとに更新し、SIDE BEACH CITY.／Code for系ネットワークを通じて大島町・観光協会・宿泊事業者と協働。他の島しょ・地方へ横展開</w:t>
       </w:r>
     </w:p>
     <w:p>
@@ -516,7 +516,7 @@
         <w:pStyle w:val="IntenseQuote"/>
       </w:pPr>
       <w:r>
-        <w:t>①GTFS-JP（公共交通オープンデータセンター）を、観光に関係する停留所だけの時刻表Markdown/CSVに自動変換する（識別子・座標・全停留所は含めず、元データを復元できない要約とすることでライセンスに配慮）。②現地の暗黙知を1トピック1ファイルのMarkdownで整理し、生成日・出典・「要確認」を明記する。③AIへの渡し方（貼り付け／添付／リンク／カスタムGPT）とプロンプト雛形を用意し、「表にない便を作らない」「帰りの船から逆算する」「荷物あり／なしで分ける」というルールを与える。④荷物の有無で旅程が組み替わる実証デモで、AIが出した旅程を時刻表と突き合わせて検証できることを示す。8/22–23に現地で実走し、暗黙知を更新します。</w:t>
+        <w:t>①GTFS-JP（公共交通オープンデータセンター）を、観光に関係する停留所だけの時刻表Markdown/CSVに自動変換する（識別子・座標・全停留所は含めず、元データを復元できない要約とすることでライセンスに配慮）。②現地の暗黙知を1トピック1ファイルのMarkdownで整理し、生成日・出典・「要確認」を明記する。③AIへの渡し方（貼り付け／添付／リンク／カスタムGPT）とプロンプト雛形を用意し、「表にない便を作らない」「帰りの船から逆算する」「荷物あり／なしで分ける」というルールを与える。④荷物の有無で旅程が組み替わる実証デモで、AIが出した旅程を時刻表と突き合わせて検証できることを示す。公式時刻表との突合と事業者への電話確認で検証し、暗黙知を更新します。</w:t>
       </w:r>
     </w:p>
     <w:p>
@@ -1090,7 +1090,7 @@
         <w:t>slides.pdf</w:t>
       </w:r>
       <w:r>
-        <w:t>（16:9・8枚）※スライド1の写真は8/22現地撮影で差替、来島者数は最新値に更新</w:t>
+        <w:t>（16:9・8枚）※写真はWikimedia Commonsのフリー素材（assets/CREDITS.md）、来島者数は最新値に更新</w:t>
       </w:r>
     </w:p>
     <w:p>
@@ -1160,7 +1160,7 @@
         <w:pStyle w:val="ListBullet"/>
       </w:pPr>
       <w:r>
-        <w:t>生成AI利用あり（②③に明記）／GTFSはODPTのライセンスに従い、公開物は元データを復元できない要約に限定／写真はチーム撮影／出典明記／BGMなし／地図を使う場合はロゴ・帰属を隠さない</w:t>
+        <w:t>生成AI利用あり（②③に明記）／GTFSはODPTのライセンスに従い、公開物は元データを復元できない要約に限定／写真はWikimedia Commonsのフリー素材（CC BY／CC BY-SA、assets/CREDITS.md に帰属明記）／出典明記／BGMなし／地図を使う場合はロゴ・帰属を隠さない</w:t>
       </w:r>
     </w:p>
     <w:p>
@@ -1200,7 +1200,7 @@
         <w:pStyle w:val="ListBullet"/>
       </w:pPr>
       <w:r>
-        <w:t>☐ slides.pdf の写真・来島者数・デモURLを更新</w:t>
+        <w:t>☐ slides.pdf の来島者数・デモURLを更新</w:t>
       </w:r>
     </w:p>
     <w:p>

</xml_diff>